<commit_message>
Updated all files to be included. Created files where necessary. Reflects changes to the docx. file. 07/05/2026.
</commit_message>
<xml_diff>
--- a/1 - The Valley That Remembers.docx
+++ b/1 - The Valley That Remembers.docx
@@ -26,6 +26,7 @@
     <w:p>
       <w:pPr>
         <w:keepNext/>
+        <w:keepLines/>
       </w:pPr>
       <w:r>
         <w:t>The three brothers paused looking at the edge of the forest, thick with trees, brambles, and scattered beams of light. The scattered light was seemingly chosen to highlight a thin, narrow trail created by the dog they had been chasing. The older ones had stopped the youngest from charging headfirst after the dog that had stolen the largest trout any of them had caught. It was late afternoon and a soft breeze brushed against their skin creating a chill, adding weight to the hesitation of following the dog.</w:t>
@@ -34,6 +35,7 @@
     <w:p>
       <w:pPr>
         <w:keepNext/>
+        <w:keepLines/>
       </w:pPr>
       <w:r>
         <w:t>Davey, sensing he’s about to be tested, is not giving up the bragging rights for that hard-won trout. He breaks free from Aaron and Kevin’s grip, plunging into the forest. They exchange a look of exasperation and Aaron proclaims, “I’m getting too old for this shit!” Kevin nods and follows Aaron in pursuit of his brother trying to dodge the brambles catching in his jeans and the pine needles penetrating his sweater to poke at his skin.</w:t>
@@ -42,6 +44,7 @@
     <w:p>
       <w:pPr>
         <w:keepNext/>
+        <w:keepLines/>
       </w:pPr>
       <w:r>
         <w:t xml:space="preserve">Aaron catches a glimpse of Davey’s wild hair as he disappears behind a large oak. </w:t>
@@ -78,6 +81,7 @@
     <w:p>
       <w:pPr>
         <w:keepNext/>
+        <w:keepLines/>
       </w:pPr>
       <w:r>
         <w:t>Kevin gives Davey a slap to the back of his head as he rolls off him. They are finally separated, lying in a row, looking at clouds turning shades of red to purple as the sun starts to set. Davey rolls over onto his stomach still rubbing the back of his head after Aaron’s impact and the slap when he remembers what caused him to stop so suddenly. He raises himself on his elbows and looks up. The dog is sitting, poised like a statue guarding a door, in a ring of aspens with the leaves shimmering gold.</w:t>
@@ -86,6 +90,7 @@
     <w:p>
       <w:pPr>
         <w:keepNext/>
+        <w:keepLines/>
       </w:pPr>
       <w:r>
         <w:t>Another chill runs down his spine. Davey realizes the dog is a painted dog belonging to the plains of Africa but seems, oddly enough, to belong here in the Rockies. He can read the mischief and see the smile on the dog’s face. At its feet is his prized rainbow trout. As he starts to crawl forward feeling a rock under his elbow, he realizes the dog is not alone. He catches his breath as he looks up and nudges Kevin beside him. Kevin rolls over and looks up, nudging Aaron who does the same. Breathing heavily from the collision, they all spot the lady behind the dog, catching and holding their collective breaths.</w:t>
@@ -94,8 +99,10 @@
     <w:p>
       <w:pPr>
         <w:keepNext/>
-      </w:pPr>
-      <w:r>
+        <w:keepLines/>
+      </w:pPr>
+      <w:r>
+        <w:lastRenderedPageBreak/>
         <w:t xml:space="preserve">She is almost as tall as and matching in size to the cinnamon bear next to her, who is resting her paw on the lady’s shoulder. Kevin is struck with a feeling of looking at a trick mirror showing the human reflection in the animal, or was it the other way around. The bear must be at least six feet tall and the woman only inches shorter. Both have wide, strong shoulders and large chests tapering down to the hips and sturdy powerful legs. They look at each other and smile. Then the bear nods to the lady, giving what looks like a playful wink. Her smile reaches her eyes as she covers the bear’s paw with her hand in a gesture of </w:t>
       </w:r>
       <w:r>
@@ -112,14 +119,16 @@
     <w:p>
       <w:pPr>
         <w:keepNext/>
-      </w:pPr>
-      <w:r>
-        <w:t xml:space="preserve">She turns her gaze onto the brothers. Her long, wavy locks are shimmering in the last bit of sun looking like copper, silver, and gold braided into a shimmering Black Hills gold. This, along with mirroring the bear, gives her the strength and stature of the ancient trees behind the aspens. As each looks into her ice blue eyes, they feel a warmth and safety instead of cold and being sized up for dinner. All fear and tension leave as they finally breathe again. </w:t>
-      </w:r>
-    </w:p>
-    <w:p>
-      <w:pPr>
-        <w:keepNext/>
+        <w:keepLines/>
+      </w:pPr>
+      <w:r>
+        <w:t>She turns her gaze onto the brothers. Her long, wavy locks are shimmering in the last bit of sun looking like copper, silver, and gold braided into a shimmering Black Hills gold. This, along with mirroring the bear, gives her the strength and stature of the ancient trees behind the aspens. As each looks into her ice blue eyes, they feel a warmth and safety instead of cold and being sized up for dinner. All fear and tension leave as they finally breathe again.</w:t>
+      </w:r>
+    </w:p>
+    <w:p>
+      <w:pPr>
+        <w:keepNext/>
+        <w:keepLines/>
       </w:pPr>
       <w:r>
         <w:t>The painted dog gives a high yip with her tail going back and forth like a possessed sweeping broom. A shrill, echoing whistle answers from above in a warning to the humans but a stern command to the dog. Everyone glances toward the sky to see a red-tailed hawk making slow circles above them, weaving in and out of the trees. The dog lets out a bark and the brothers jump. They shift their gaze back to the dog as the dog picks up the fish and places it just out of reach of the brothers.</w:t>
@@ -128,6 +137,7 @@
     <w:p>
       <w:pPr>
         <w:keepNext/>
+        <w:keepLines/>
       </w:pPr>
       <w:r>
         <w:t xml:space="preserve">Another challenging grin appears across the dog’s face as it yips and drops into a crouch challenging one of them to reach for it. Davey cannot resist the challenge and glances at the lady for her disapproval. Finding none, he tries to quickly snatch the trout, but it slips out of Davey’s fingers. Kevin lunges, grabbing at it, but it slips through his palms and as Aaron reaches for the fish, the dog snatches it out of his grasp. The lady lets slip a soft laugh that reminds Kevin of the wind chimes on his grandmother’s porch. The </w:t>
@@ -148,6 +158,7 @@
     <w:p>
       <w:pPr>
         <w:keepNext/>
+        <w:keepLines/>
       </w:pPr>
       <w:r>
         <w:t>As the laughter settles, the men realize that night is falling, and the lady senses the fear of the darkness descending on them along with the doubts about which direction their camp lies. She leans over, holding her hand out, and the dog places the fish in her hand, which she then offers to Davey. Davey stands and senses his brothers do the same. He suddenly feels very tiny in the group of taller adults. He timidly takes the fish from her and tries to thank her, but finds his voice fails him. Suddenly aware of the smell of fish and musky sweat, he blushes and tries to speak again, but Kevin, his love for dogs shining through, interrupts, asking simply, “Yours?”</w:t>
@@ -156,14 +167,17 @@
     <w:p>
       <w:pPr>
         <w:keepNext/>
-      </w:pPr>
-      <w:r>
+        <w:keepLines/>
+      </w:pPr>
+      <w:r>
+        <w:lastRenderedPageBreak/>
         <w:t>She shifts her gaze to Kevin who is now scratching the dog between the ears. The lady replies, “She chose me.” At the sound of the lady’s voice, the dog steps back to sit next to the lady, tail wagging and head cocked with an air of wanting to continue to play. The lady smiles again and looks at the sky, the first few stars twinkling into life as the mountains glow from the sun setting for the night. She allows her gaze to settle on the brothers and says, “I’m Lea. Follow me.”</w:t>
       </w:r>
     </w:p>
     <w:p>
       <w:pPr>
         <w:keepNext/>
+        <w:keepLines/>
       </w:pPr>
       <w:r>
         <w:t xml:space="preserve">She turns and starts walking in the same direction the cinnamon bear had disappeared into. Aaron, Kevin, and Davey slip into formation behind her and the dog as they enter the dark of the forest. Aaron gets lost in his thoughts as he watches his younger brothers in front of him, suddenly seeing them as five and six on an adventure with their mom. He has missed her for these past twenty years. A small ache of grief hits him as he remembers she died at the age he just celebrated. </w:t>
@@ -181,6 +195,7 @@
     <w:p>
       <w:pPr>
         <w:keepNext/>
+        <w:keepLines/>
       </w:pPr>
       <w:r>
         <w:t>He notices the darkness that has settled around them, except for the lady who has an almost ethereal glow surrounding them. He smells the smoke of a campfire and suddenly catches the scents of bread and spices filling the air. His stomach growls in agreement. He sees the glow of two campfires before his mind catches up to the illusion of the second fire perfectly reflecting in a lake. As he clears the trees, he stops in wonder at the valley before him. Not in complete darkness, but lit from above by the last glow of the sun, the stars, the Milky Way, while the fire seems to fill the valley with warmth and a soft glow. He listens to the melody of the forest settling down for the night as Lea softly whispers, “Welcome to my Valley.”</w:t>
@@ -189,6 +204,7 @@
     <w:p>
       <w:pPr>
         <w:keepNext/>
+        <w:keepLines/>
       </w:pPr>
       <w:r>
         <w:t>Kevin takes a deep breath, savoring the floral and honeysuckle scents the valley is filled with, and it reminds him of home. He watches Lea and the dog walk towards the campfire and feels a small breeze with a hint of softness brush against him. He watches in awe as a wolf passes by quietly padding in to walk on the other side of Lea as she glides toward the lake. Aaron brushes past him, and he falls into step with his older brother glancing towards Davey.</w:t>
@@ -197,6 +213,7 @@
     <w:p>
       <w:pPr>
         <w:keepNext/>
+        <w:keepLines/>
       </w:pPr>
       <w:r>
         <w:t>He stumbles as his mind catches up with the image of Davey at six, when his heart reminds him Davey has always been a kid at heart. Reaching out for Aaron, his big brother steadies him. At his brother’s touch, memories flood him of being eight and Aaron teaching him to skate. Aaron makes sure he’s stable before turning and catching up to Davey. He looks down at himself and then looks for Aaron and Davey. His heart fills with glee as they have all returned to a time when they were young and wild and free.</w:t>
@@ -205,14 +222,17 @@
     <w:p>
       <w:pPr>
         <w:keepNext/>
-      </w:pPr>
-      <w:r>
+        <w:keepLines/>
+      </w:pPr>
+      <w:r>
+        <w:lastRenderedPageBreak/>
         <w:t>Lea, with the dog and wolf to each side of her, enters the glow of the campfire. The canine pair go and settle in next to the lake, close enough to watch but not close enough to be in the way. She goes to some saddle bags, and the smell of old, oiled leather overpowers the food cooking on the fire as she loosens the buckles and flips the flaps back. She hands him a tightly woven grass mesh bag. Lea instructs him what to do with it. “Place your fish in this mesh bag. Then, secure it to the post there by the rocky outcrop. Lower it into the deeper, cooler water and it will stay fresh until the morning.”</w:t>
       </w:r>
     </w:p>
     <w:p>
       <w:pPr>
         <w:keepNext/>
+        <w:keepLines/>
       </w:pPr>
       <w:r>
         <w:t>Davey, still shy, squeaks out, “Thanks.” Davey turns only to run into his brothers again like a brick wall. He drops the bag and the fish. They are not the men he entered with but the boys who took him on his first camping and fishing trip at the tender age of six. All three bend over at once to reach down and pick up the bag and fish, heads knocking together. Davey glares at his brothers, irritated that no one got the bag. “Just let me get it,” he grumbles, picking up the bag and holding it open. Aaron dangles the fish for a few heartbeats over the open bag, before dropping the fish inside. Davey shoves Kevin roughly out of the way. Kevin responds by sticking his tongue out at his little brother. Aaron rolls his eyes and remembers why the Irish twins at six was not all that great for him.</w:t>
@@ -221,6 +241,7 @@
     <w:p>
       <w:pPr>
         <w:keepNext/>
+        <w:keepLines/>
       </w:pPr>
       <w:r>
         <w:t xml:space="preserve">Lea chuckles and hands them a basin, soap, and towels, gently pushing them in the direction Davey went. Kevin kneels down, filling the basin from the lake, and it immediately begins to cool in his hands. He places the basin on the flat part of the rocky outcrop thinking </w:t>
@@ -235,6 +256,7 @@
     <w:p>
       <w:pPr>
         <w:keepNext/>
+        <w:keepLines/>
       </w:pPr>
       <w:r>
         <w:t>Satisfied they are done and washing properly, Aaron waits patiently for his turn. Something begins tugging inside him. He turns to watch Lea busy at the fire and notices how the glow seems to soften her more as she removes a large pot and pan from the coals. She rises and fills a coffee pot with water, returns to her bags to fill it with coffee, and places it on the rocks to warm and brew. There is something familiar and comforting about her. She tucks a loose strand of hair behind her ear, and he has a flash of déjà vu which leaves as quickly as it came. He turns back to his brothers only to be met with two damp towels chucked into his face. They shoulder past him, trying to knock him back. He sighs, peeling the towels off, and goes to wash.</w:t>
@@ -243,6 +265,7 @@
     <w:p>
       <w:pPr>
         <w:keepNext/>
+        <w:keepLines/>
       </w:pPr>
       <w:r>
         <w:t>They look around, not sure where to go next. Without looking up from the pot she is dishing from, Lea calmly states, “Pull up some dirt boys, and have a seat.” They shrug and sit down cross-legged close to the fire like they have done so many times before. Kevin admires the beauty of the rocks arranged to create a cooking and containment area he had only seen in old westerns.</w:t>
@@ -251,14 +274,17 @@
     <w:p>
       <w:pPr>
         <w:keepNext/>
-      </w:pPr>
-      <w:r>
+        <w:keepLines/>
+      </w:pPr>
+      <w:r>
+        <w:lastRenderedPageBreak/>
         <w:t>Kevin looks up as Aaron returns, smelling of sage, and watches him hand the items back to Lea. He notices how there seems to be an ease between the two with no words spoken, but moving quietly in sync. She hands him two bowls, picks up two more from near the fire. She walks over, handing one of the bowls to him, gracefully folding herself down into the cross-legged posture across from them. Aaron hands Davey a bowl and takes his place between her and Davey.</w:t>
       </w:r>
     </w:p>
     <w:p>
       <w:pPr>
         <w:keepNext/>
+        <w:keepLines/>
       </w:pPr>
       <w:r>
         <w:t>She reaches around, grabs four tin cups, and fills them with the coffee pot, placing one in front of each of them. The bowls, still steaming, are filled with a spicy, sweet vegetable stew with cornbread wedges that remind each of them of sitting in their grandmother’s kitchen on a cool fall night. Davey’s is gone before the others are half finished, and he panics, wondering if he’s allowed seconds. He reaches for his cup, taking a big drink. He has swallowed half of it before it registers it’s not the coffee he was expecting. He’s drinking tea with a hint of mint, something soothing he can’t place, and sweetened with blackberries.</w:t>
@@ -267,6 +293,7 @@
     <w:p>
       <w:pPr>
         <w:keepNext/>
+        <w:keepLines/>
       </w:pPr>
       <w:r>
         <w:t>Davey looks at Lea, who has a mischievous smile on her face, knowing he discovered her deception. She nods her cup to him and takes a drink before offering her hand for his bowl. She rises gracefully and fills his bowl again. She uses another towel to lift the pot, returning to offer more to his brothers while handing him his now full bowl and another cornbread wedge. She puts the last in her bowl and moves to the lake to fill the pot with water, setting it on the outside of the fire. She grabs the last three cornbread wedges from the pan before returning and handing them out. She returns to her seated position and fills her cup, placing the coffee pot between them.</w:t>
@@ -275,6 +302,7 @@
     <w:p>
       <w:pPr>
         <w:keepNext/>
+        <w:keepLines/>
       </w:pPr>
       <w:r>
         <w:t>Davey goes to wipe the crumbs from his fingers on his pants leg and finds a towel in his lap instead. Lea offers a soft reprimand. “Don’t dirty your pants, use that.”</w:t>
@@ -283,6 +311,7 @@
     <w:p>
       <w:pPr>
         <w:keepNext/>
+        <w:keepLines/>
       </w:pPr>
       <w:r>
         <w:t>Kevin chuckles softly. “Even she knows how messy you are. Feels like the whole world slows down here. I could learn to like this.”</w:t>
@@ -291,6 +320,7 @@
     <w:p>
       <w:pPr>
         <w:keepNext/>
+        <w:keepLines/>
       </w:pPr>
       <w:r>
         <w:t>Lea smiles. “Time marches on, but the peace and comfort of the valley offers that illusion.”</w:t>
@@ -299,6 +329,7 @@
     <w:p>
       <w:pPr>
         <w:keepNext/>
+        <w:keepLines/>
       </w:pPr>
       <w:r>
         <w:t>Aaron swallows hard and feels that tug in himself again. Mistaking it as a nudge for forgetting his manners, he speaks in a low tone, “I’m sorry. We’ve forgotten our manners. Thank you for taking us in and for feeding us. May I help with the dishes?” Kevin and Davey chime in with their thanks as well while Aaron and Lea gather the cups and dishes, still moving as one.</w:t>
@@ -307,6 +338,7 @@
     <w:p>
       <w:pPr>
         <w:keepNext/>
+        <w:keepLines/>
       </w:pPr>
       <w:r>
         <w:t>Lea nods toward the wolf and dog. “You are most welcome. I’m sorry for the trouble with the fish today, but she is one to always play and be happy.” She and Aaron walk to the edge of the lake and make quick work of the washing. Aaron settles back next to Davey, and before Lea can make a move to reclaim her place, she looks up at the sky and quietly adds, “Another visitor tonight. The inn is full.”</w:t>
@@ -315,8 +347,10 @@
     <w:p>
       <w:pPr>
         <w:keepNext/>
-      </w:pPr>
-      <w:r>
+        <w:keepLines/>
+      </w:pPr>
+      <w:r>
+        <w:lastRenderedPageBreak/>
         <w:t xml:space="preserve">Full and sated, the brothers lean back and watch the sparks drift like fireflies as Lea adds another log to the fire. As the sparks fade out, the hawk slowly circles down just out of the reach of the flames. Lea moves back a few steps and reaches out her arm where the hawk lands. </w:t>
       </w:r>
       <w:r>
@@ -326,6 +360,7 @@
     <w:p>
       <w:pPr>
         <w:keepNext/>
+        <w:keepLines/>
       </w:pPr>
       <w:r>
         <w:t>The dog and wolf take up their positions beside her as she pivots and moves toward the far end of the lake, where a willow is gently swaying in the breeze. She nods goodnight to the cinnamon bear as she enters the canopy of branches to lay her head for the night. Lea</w:t>
@@ -379,6 +414,7 @@
     <w:p>
       <w:pPr>
         <w:keepNext/>
+        <w:keepLines/>
       </w:pPr>
       <w:r>
         <w:t>They approach and stand before the brothers just on the other side of the fire. The cougar</w:t>
@@ -417,6 +453,7 @@
     <w:p>
       <w:pPr>
         <w:keepNext/>
+        <w:keepLines/>
       </w:pPr>
       <w:r>
         <w:t xml:space="preserve">She rises and walks behind </w:t>
@@ -539,6 +576,7 @@
     <w:p>
       <w:pPr>
         <w:keepNext/>
+        <w:keepLines/>
       </w:pPr>
       <w:r>
         <w:t>The cougar lets out a small mew and yawns again</w:t>
@@ -610,13 +648,7 @@
     <w:p>
       <w:pPr>
         <w:keepNext/>
-        <w:sectPr>
-          <w:footerReference w:type="default" r:id="rId7"/>
-          <w:pgSz w:w="12240" w:h="15840"/>
-          <w:pgMar w:top="1440" w:right="1440" w:bottom="1440" w:left="1440" w:header="720" w:footer="720" w:gutter="0"/>
-          <w:cols w:space="720"/>
-          <w:docGrid w:linePitch="360"/>
-        </w:sectPr>
+        <w:keepLines/>
       </w:pPr>
       <w:r>
         <w:t>The guardians</w:t>
@@ -712,13 +744,8 @@
         <w:t xml:space="preserve"> They are home.</w:t>
       </w:r>
     </w:p>
-    <w:p>
-      <w:pPr>
-        <w:keepNext/>
-      </w:pPr>
-    </w:p>
     <w:sectPr>
-      <w:footerReference w:type="default" r:id="rId8"/>
+      <w:footerReference w:type="default" r:id="rId7"/>
       <w:pgSz w:w="12240" w:h="15840"/>
       <w:pgMar w:top="1440" w:right="1440" w:bottom="1440" w:left="1440" w:header="720" w:footer="720" w:gutter="0"/>
       <w:cols w:space="720"/>
@@ -754,59 +781,6 @@
 </file>
 
 <file path=word/footer1.xml><?xml version="1.0" encoding="utf-8"?>
-<w:ftr xmlns:wpc="http://schemas.microsoft.com/office/word/2010/wordprocessingCanvas" xmlns:cx="http://schemas.microsoft.com/office/drawing/2014/chartex" xmlns:cx1="http://schemas.microsoft.com/office/drawing/2015/9/8/chartex" xmlns:cx2="http://schemas.microsoft.com/office/drawing/2015/10/21/chartex" xmlns:cx3="http://schemas.microsoft.com/office/drawing/2016/5/9/chartex" xmlns:cx4="http://schemas.microsoft.com/office/drawing/2016/5/10/chartex" xmlns:cx5="http://schemas.microsoft.com/office/drawing/2016/5/11/chartex" xmlns:cx6="http://schemas.microsoft.com/office/drawing/2016/5/12/chartex" xmlns:cx7="http://schemas.microsoft.com/office/drawing/2016/5/13/chartex" xmlns:cx8="http://schemas.microsoft.com/office/drawing/2016/5/14/chartex" xmlns:mc="http://schemas.openxmlformats.org/markup-compatibility/2006" xmlns:aink="http://schemas.microsoft.com/office/drawing/2016/ink" xmlns:am3d="http://schemas.microsoft.com/office/drawing/2017/model3d" xmlns:o="urn:schemas-microsoft-com:office:office" xmlns:oel="http://schemas.microsoft.com/office/2019/extlst" xmlns:r="http://schemas.openxmlformats.org/officeDocument/2006/relationships" xmlns:m="http://schemas.openxmlformats.org/officeDocument/2006/math" xmlns:v="urn:schemas-microsoft-com:vml" xmlns:wp14="http://schemas.microsoft.com/office/word/2010/wordprocessingDrawing" xmlns:wp="http://schemas.openxmlformats.org/drawingml/2006/wordprocessingDrawing" xmlns:w10="urn:schemas-microsoft-com:office:word" xmlns:w="http://schemas.openxmlformats.org/wordprocessingml/2006/main" xmlns:w14="http://schemas.microsoft.com/office/word/2010/wordml" xmlns:w15="http://schemas.microsoft.com/office/word/2012/wordml" xmlns:w16cex="http://schemas.microsoft.com/office/word/2018/wordml/cex" xmlns:w16cid="http://schemas.microsoft.com/office/word/2016/wordml/cid" xmlns:w16="http://schemas.microsoft.com/office/word/2018/wordml" xmlns:w16du="http://schemas.microsoft.com/office/word/2023/wordml/word16du" xmlns:w16sdtdh="http://schemas.microsoft.com/office/word/2020/wordml/sdtdatahash" xmlns:w16sdtfl="http://schemas.microsoft.com/office/word/2024/wordml/sdtformatlock" xmlns:w16se="http://schemas.microsoft.com/office/word/2015/wordml/symex" xmlns:wpg="http://schemas.microsoft.com/office/word/2010/wordprocessingGroup" xmlns:wpi="http://schemas.microsoft.com/office/word/2010/wordprocessingInk" xmlns:wne="http://schemas.microsoft.com/office/word/2006/wordml" xmlns:wps="http://schemas.microsoft.com/office/word/2010/wordprocessingShape" mc:Ignorable="w14 w15 w16se w16cid w16 w16cex w16sdtdh w16sdtfl w16du wp14">
-  <w:sdt>
-    <w:sdtPr>
-      <w:id w:val="-1106970883"/>
-      <w:docPartObj>
-        <w:docPartGallery w:val="Page Numbers (Bottom of Page)"/>
-        <w:docPartUnique/>
-      </w:docPartObj>
-    </w:sdtPr>
-    <w:sdtEndPr>
-      <w:rPr>
-        <w:noProof/>
-      </w:rPr>
-    </w:sdtEndPr>
-    <w:sdtContent>
-      <w:p>
-        <w:pPr>
-          <w:pStyle w:val="Footer"/>
-          <w:jc w:val="right"/>
-        </w:pPr>
-        <w:r>
-          <w:fldChar w:fldCharType="begin"/>
-        </w:r>
-        <w:r>
-          <w:instrText xml:space="preserve"> PAGE   \* MERGEFORMAT </w:instrText>
-        </w:r>
-        <w:r>
-          <w:fldChar w:fldCharType="separate"/>
-        </w:r>
-        <w:r>
-          <w:rPr>
-            <w:noProof/>
-          </w:rPr>
-          <w:t>2</w:t>
-        </w:r>
-        <w:r>
-          <w:rPr>
-            <w:noProof/>
-          </w:rPr>
-          <w:fldChar w:fldCharType="end"/>
-        </w:r>
-      </w:p>
-    </w:sdtContent>
-  </w:sdt>
-  <w:p>
-    <w:pPr>
-      <w:pStyle w:val="Footer"/>
-    </w:pPr>
-  </w:p>
-</w:ftr>
-</file>
-
-<file path=word/footer2.xml><?xml version="1.0" encoding="utf-8"?>
 <w:ftr xmlns:wpc="http://schemas.microsoft.com/office/word/2010/wordprocessingCanvas" xmlns:cx="http://schemas.microsoft.com/office/drawing/2014/chartex" xmlns:cx1="http://schemas.microsoft.com/office/drawing/2015/9/8/chartex" xmlns:cx2="http://schemas.microsoft.com/office/drawing/2015/10/21/chartex" xmlns:cx3="http://schemas.microsoft.com/office/drawing/2016/5/9/chartex" xmlns:cx4="http://schemas.microsoft.com/office/drawing/2016/5/10/chartex" xmlns:cx5="http://schemas.microsoft.com/office/drawing/2016/5/11/chartex" xmlns:cx6="http://schemas.microsoft.com/office/drawing/2016/5/12/chartex" xmlns:cx7="http://schemas.microsoft.com/office/drawing/2016/5/13/chartex" xmlns:cx8="http://schemas.microsoft.com/office/drawing/2016/5/14/chartex" xmlns:mc="http://schemas.openxmlformats.org/markup-compatibility/2006" xmlns:aink="http://schemas.microsoft.com/office/drawing/2016/ink" xmlns:am3d="http://schemas.microsoft.com/office/drawing/2017/model3d" xmlns:o="urn:schemas-microsoft-com:office:office" xmlns:oel="http://schemas.microsoft.com/office/2019/extlst" xmlns:r="http://schemas.openxmlformats.org/officeDocument/2006/relationships" xmlns:m="http://schemas.openxmlformats.org/officeDocument/2006/math" xmlns:v="urn:schemas-microsoft-com:vml" xmlns:wp14="http://schemas.microsoft.com/office/word/2010/wordprocessingDrawing" xmlns:wp="http://schemas.openxmlformats.org/drawingml/2006/wordprocessingDrawing" xmlns:w10="urn:schemas-microsoft-com:office:word" xmlns:w="http://schemas.openxmlformats.org/wordprocessingml/2006/main" xmlns:w14="http://schemas.microsoft.com/office/word/2010/wordml" xmlns:w15="http://schemas.microsoft.com/office/word/2012/wordml" xmlns:w16cex="http://schemas.microsoft.com/office/word/2018/wordml/cex" xmlns:w16cid="http://schemas.microsoft.com/office/word/2016/wordml/cid" xmlns:w16="http://schemas.microsoft.com/office/word/2018/wordml" xmlns:w16du="http://schemas.microsoft.com/office/word/2023/wordml/word16du" xmlns:w16sdtdh="http://schemas.microsoft.com/office/word/2020/wordml/sdtdatahash" xmlns:w16sdtfl="http://schemas.microsoft.com/office/word/2024/wordml/sdtformatlock" xmlns:w16se="http://schemas.microsoft.com/office/word/2015/wordml/symex" xmlns:wpg="http://schemas.microsoft.com/office/word/2010/wordprocessingGroup" xmlns:wpi="http://schemas.microsoft.com/office/word/2010/wordprocessingInk" xmlns:wne="http://schemas.microsoft.com/office/word/2006/wordml" xmlns:wps="http://schemas.microsoft.com/office/word/2010/wordprocessingShape" mc:Ignorable="w14 w15 w16se w16cid w16 w16cex w16sdtdh w16sdtfl w16du wp14">
   <w:sdt>
     <w:sdtPr>

</xml_diff>

<commit_message>
Major overhauls cleanup of workspace and files.
</commit_message>
<xml_diff>
--- a/1 - The Valley That Remembers.docx
+++ b/1 - The Valley That Remembers.docx
@@ -5,7 +5,7 @@
   <w:body>
     <w:p>
       <w:pPr>
-        <w:pStyle w:val="Heading1"/>
+        <w:pStyle w:val="Heading2"/>
       </w:pPr>
       <w:bookmarkStart w:id="0" w:name="_Toc231080401"/>
       <w:bookmarkStart w:id="1" w:name="_Toc231082561"/>
@@ -63,57 +63,77 @@
         <w:t>Davey really does have a hard head</w:t>
       </w:r>
       <w:r>
-        <w:t xml:space="preserve"> as it collides with his chest. </w:t>
-      </w:r>
-      <w:r>
-        <w:t xml:space="preserve">Aaron rubbing his chest through his hoodie is unexpectedly thrust against Davey when Kevin rounds the oak at full speed. Davey, still trying to regain his balance, fails when Aaron is propelled into him after Kevin collides with </w:t>
-      </w:r>
-      <w:r>
-        <w:t>Aaron</w:t>
-      </w:r>
-      <w:r>
-        <w:t>.</w:t>
-      </w:r>
-      <w:r>
-        <w:t xml:space="preserve"> Aaron feels like he was just hit with a rosin bag from his days in minor league baseball as the three brothers go down in a tangle of limbs mixing with the damp mulch. Trading punches, kicks and curses, they try to extract themselves from each other.</w:t>
-      </w:r>
-    </w:p>
-    <w:p>
-      <w:pPr>
-        <w:keepNext/>
-        <w:keepLines/>
-      </w:pPr>
-      <w:r>
-        <w:t>Kevin gives Davey a slap to the back of his head as he rolls off him. They are finally separated, lying in a row, looking at clouds turning shades of red to purple as the sun starts to set. Davey rolls over onto his stomach still rubbing the back of his head after Aaron’s impact and the slap when he remembers what caused him to stop so suddenly. He raises himself on his elbows and looks up. The dog is sitting, poised like a statue guarding a door, in a ring of aspens with the leaves shimmering gold.</w:t>
-      </w:r>
-    </w:p>
-    <w:p>
-      <w:pPr>
-        <w:keepNext/>
-        <w:keepLines/>
-      </w:pPr>
-      <w:r>
-        <w:t>Another chill runs down his spine. Davey realizes the dog is a painted dog belonging to the plains of Africa but seems, oddly enough, to belong here in the Rockies. He can read the mischief and see the smile on the dog’s face. At its feet is his prized rainbow trout. As he starts to crawl forward feeling a rock under his elbow, he realizes the dog is not alone. He catches his breath as he looks up and nudges Kevin beside him. Kevin rolls over and looks up, nudging Aaron who does the same. Breathing heavily from the collision, they all spot the lady behind the dog, catching and holding their collective breaths.</w:t>
-      </w:r>
-    </w:p>
-    <w:p>
-      <w:pPr>
-        <w:keepNext/>
-        <w:keepLines/>
-      </w:pPr>
-      <w:r>
-        <w:lastRenderedPageBreak/>
-        <w:t xml:space="preserve">She is almost as tall as and matching in size to the cinnamon bear next to her, who is resting her paw on the lady’s shoulder. Kevin is struck with a feeling of looking at a trick mirror showing the human reflection in the animal, or was it the other way around. The bear must be at least six feet tall and the woman only inches shorter. Both have wide, strong shoulders and large chests tapering down to the hips and sturdy powerful legs. They look at each other and smile. Then the bear nods to the lady, giving what looks like a playful wink. Her smile reaches her eyes as she covers the bear’s paw with her hand in a gesture of </w:t>
-      </w:r>
-      <w:r>
         <w:rPr>
           <w:i/>
           <w:iCs/>
         </w:rPr>
-        <w:t>I got this</w:t>
-      </w:r>
-      <w:r>
-        <w:t>. The bear pivots and drops with a soft thud the brothers feel through the ground into their bodies, disappearing into the forest behind her.</w:t>
+        <w:t>,</w:t>
+      </w:r>
+      <w:r>
+        <w:t xml:space="preserve"> as it collides with his chest. </w:t>
+      </w:r>
+      <w:r>
+        <w:t xml:space="preserve">Aaron rubbing his chest through his hoodie is unexpectedly thrust against Davey when Kevin rounds the oak at full speed. Davey, still trying to regain his balance, fails when Aaron is propelled into him after Kevin collides with </w:t>
+      </w:r>
+      <w:r>
+        <w:t>Aaron</w:t>
+      </w:r>
+      <w:r>
+        <w:t>.</w:t>
+      </w:r>
+      <w:r>
+        <w:t xml:space="preserve"> Aaron feels like he was just hit with a rosin bag from his days in minor league baseball as the three brothers go down in a tangle of limbs mixing with the damp mulch. Trading punches, kicks and curses, they try to extract themselves from each other.</w:t>
+      </w:r>
+    </w:p>
+    <w:p>
+      <w:pPr>
+        <w:keepNext/>
+        <w:keepLines/>
+      </w:pPr>
+      <w:r>
+        <w:t>Kevin gives Davey a slap to the back of his head as he rolls off him. They are finally separated, lying in a row, looking at clouds turning shades of red to purple as the sun starts to set. Davey rolls over onto his stomach still rubbing the back of his head after Aaron’s impact and the slap when he remembers what caused him to stop so suddenly. He raises himself on his elbows and looks up. The dog is sitting, poised like a statue guarding a door, in a ring of aspens with the leaves shimmering gold.</w:t>
+      </w:r>
+    </w:p>
+    <w:p>
+      <w:pPr>
+        <w:keepNext/>
+        <w:keepLines/>
+      </w:pPr>
+      <w:r>
+        <w:t>Another chill runs down his spine. Davey realizes the dog is a painted dog belonging to the plains of Africa but seems, oddly enough, to belong here in the Rockies. He can read the mischief and see the smile on the dog’s face. At its feet is his prized rainbow trout. As he starts to crawl forward feeling a rock under his elbow, he realizes the dog is not alone. He catches his breath as he looks up and nudges Kevin beside him. Kevin rolls over and looks up, nudging Aaron who does the same. Breathing heavily from the collision, they all spot the lady behind the dog, catching and holding their collective breaths.</w:t>
+      </w:r>
+    </w:p>
+    <w:p>
+      <w:pPr>
+        <w:keepNext/>
+        <w:keepLines/>
+      </w:pPr>
+      <w:r>
+        <w:lastRenderedPageBreak/>
+        <w:t xml:space="preserve">She is almost as tall as and matching in size to the cinnamon bear next to her, who is resting her paw on the lady’s shoulder. Kevin is struck with a feeling of looking at a trick mirror showing the human reflection in the animal, or was it the other way around. The bear must be at least six feet tall and the woman only inches shorter. Both have wide, strong shoulders and large chests tapering down to the hips and sturdy powerful legs. They look at each other and smile. Then the bear nods to the lady, giving what looks like a playful wink. Her smile reaches her eyes as she covers the bear’s paw with her hand in a </w:t>
+      </w:r>
+      <w:r>
+        <w:t xml:space="preserve">gesture of </w:t>
+      </w:r>
+      <w:r>
+        <w:rPr>
+          <w:i/>
+          <w:iCs/>
+        </w:rPr>
+        <w:t xml:space="preserve">I got </w:t>
+      </w:r>
+      <w:r>
+        <w:rPr>
+          <w:i/>
+          <w:iCs/>
+        </w:rPr>
+        <w:t>this.</w:t>
+      </w:r>
+      <w:r>
+        <w:t xml:space="preserve"> The</w:t>
+      </w:r>
+      <w:r>
+        <w:t xml:space="preserve"> bear pivots and drops with a soft thud the brothers feel through the ground into their bodies, disappearing into the forest behind her.</w:t>
       </w:r>
     </w:p>
     <w:p>
@@ -1368,7 +1388,7 @@
     <w:autoRedefine/>
     <w:uiPriority w:val="9"/>
     <w:qFormat/>
-    <w:rsid w:val="00C141E1"/>
+    <w:rsid w:val="008D740B"/>
     <w:pPr>
       <w:keepNext/>
       <w:keepLines/>
@@ -1378,7 +1398,7 @@
     </w:pPr>
     <w:rPr>
       <w:rFonts w:eastAsiaTheme="majorEastAsia" w:cstheme="majorBidi"/>
-      <w:sz w:val="56"/>
+      <w:sz w:val="72"/>
       <w:szCs w:val="40"/>
     </w:rPr>
   </w:style>
@@ -1387,21 +1407,21 @@
     <w:basedOn w:val="Normal"/>
     <w:next w:val="Normal"/>
     <w:link w:val="Heading2Char"/>
+    <w:autoRedefine/>
     <w:uiPriority w:val="9"/>
-    <w:semiHidden/>
     <w:unhideWhenUsed/>
     <w:qFormat/>
-    <w:rsid w:val="0051428B"/>
+    <w:rsid w:val="00F41C7B"/>
     <w:pPr>
       <w:keepNext/>
       <w:keepLines/>
-      <w:spacing w:before="160" w:after="80"/>
+      <w:spacing w:after="240"/>
+      <w:jc w:val="center"/>
       <w:outlineLvl w:val="1"/>
     </w:pPr>
     <w:rPr>
       <w:rFonts w:eastAsiaTheme="majorEastAsia" w:cstheme="majorBidi"/>
-      <w:color w:val="365F91" w:themeColor="accent1" w:themeShade="BF"/>
-      <w:sz w:val="32"/>
+      <w:sz w:val="56"/>
       <w:szCs w:val="32"/>
     </w:rPr>
   </w:style>
@@ -1592,12 +1612,10 @@
     <w:basedOn w:val="DefaultParagraphFont"/>
     <w:link w:val="Heading2"/>
     <w:uiPriority w:val="9"/>
-    <w:semiHidden/>
-    <w:rsid w:val="0051428B"/>
+    <w:rsid w:val="00F41C7B"/>
     <w:rPr>
       <w:rFonts w:ascii="Times New Roman" w:eastAsiaTheme="majorEastAsia" w:hAnsi="Times New Roman" w:cstheme="majorBidi"/>
-      <w:color w:val="365F91" w:themeColor="accent1" w:themeShade="BF"/>
-      <w:sz w:val="32"/>
+      <w:sz w:val="56"/>
       <w:szCs w:val="32"/>
     </w:rPr>
   </w:style>
@@ -1618,10 +1636,10 @@
     <w:basedOn w:val="DefaultParagraphFont"/>
     <w:link w:val="Heading1"/>
     <w:uiPriority w:val="9"/>
-    <w:rsid w:val="00C141E1"/>
+    <w:rsid w:val="008D740B"/>
     <w:rPr>
       <w:rFonts w:ascii="Times New Roman" w:eastAsiaTheme="majorEastAsia" w:hAnsi="Times New Roman" w:cstheme="majorBidi"/>
-      <w:sz w:val="56"/>
+      <w:sz w:val="72"/>
       <w:szCs w:val="40"/>
     </w:rPr>
   </w:style>

</xml_diff>